<commit_message>
Enlaces a las referencias de los tres autores
- Delfina Lafuente Veira: su trayectoria oficial en pozuelodealarcon.org
- José Antonio Ondiviela García: su perfil en ufv.es
- Miguel Ángel Domínguez Castellano: miguelangeldominguez.info

En el documento, el resumen, la web, el Word y la presentación. Las tres URL
comprobadas antes de ponerlas.

De paso, el generador de Word hace ahora hipervínculos de verdad: el parser de
estilos en línea era plano y se tragaba los enlaces dentro de la negrita, que es
exactamente el caso de los créditos, así que salían azules pero muertos.

Co-Authored-By: Claude Opus 5 <noreply@anthropic.com>
</commit_message>
<xml_diff>
--- a/docs/descargas/resumen-dos-paginas.docx
+++ b/docs/descargas/resumen-dos-paginas.docx
@@ -1462,17 +1462,20 @@
         <w:spacing w:after="140"/>
         <w:jc w:val="center"/>
       </w:pPr>
-      <w:r>
-        <w:rPr>
-          <w:rFonts w:ascii="Calibri" w:cs="Calibri" w:eastAsia="Calibri" w:hAnsi="Calibri"/>
-          <w:b/>
-          <w:bCs/>
-          <w:color w:val="595959"/>
-          <w:sz w:val="20"/>
-          <w:szCs w:val="20"/>
-        </w:rPr>
-        <w:t xml:space="preserve">Delfina Lafuente Veira</w:t>
-      </w:r>
+      <w:hyperlink w:history="1" r:id="rId_lbl05sxbytlv16lpav9p">
+        <w:r>
+          <w:rPr>
+            <w:rFonts w:ascii="Calibri" w:cs="Calibri" w:eastAsia="Calibri" w:hAnsi="Calibri"/>
+            <w:b/>
+            <w:bCs/>
+            <w:color w:val="2F5496"/>
+            <w:sz w:val="20"/>
+            <w:szCs w:val="20"/>
+            <w:u w:val="single"/>
+          </w:rPr>
+          <w:t xml:space="preserve">Delfina Lafuente Veira</w:t>
+        </w:r>
+      </w:hyperlink>
       <w:r>
         <w:rPr>
           <w:rFonts w:ascii="Calibri" w:cs="Calibri" w:eastAsia="Calibri" w:hAnsi="Calibri"/>
@@ -1495,49 +1498,75 @@
           <w:sz w:val="20"/>
           <w:szCs w:val="20"/>
         </w:rPr>
-        <w:t xml:space="preserve">de Pozuelo de Alarcón: de ella nace el proyecto y suya es la primera redacción. **Dr. José Antonio</w:t>
-      </w:r>
-    </w:p>
-    <w:p>
-      <w:pPr>
-        <w:spacing w:after="140"/>
-        <w:jc w:val="center"/>
-      </w:pPr>
-      <w:r>
-        <w:rPr>
-          <w:rFonts w:ascii="Calibri" w:cs="Calibri" w:eastAsia="Calibri" w:hAnsi="Calibri"/>
-          <w:color w:val="595959"/>
-          <w:sz w:val="20"/>
-          <w:szCs w:val="20"/>
-        </w:rPr>
-        <w:t xml:space="preserve">Ondiviela García**, profesor e investigador de la Universidad Francisco de Vitoria: la mirada del</w:t>
-      </w:r>
-    </w:p>
-    <w:p>
-      <w:pPr>
-        <w:spacing w:after="140"/>
-        <w:jc w:val="center"/>
-      </w:pPr>
-      <w:r>
-        <w:rPr>
-          <w:rFonts w:ascii="Calibri" w:cs="Calibri" w:eastAsia="Calibri" w:hAnsi="Calibri"/>
-          <w:color w:val="595959"/>
-          <w:sz w:val="20"/>
-          <w:szCs w:val="20"/>
-        </w:rPr>
-        <w:t xml:space="preserve">mercado y la idea que resuelve el problema de fondo. </w:t>
-      </w:r>
-      <w:r>
-        <w:rPr>
-          <w:rFonts w:ascii="Calibri" w:cs="Calibri" w:eastAsia="Calibri" w:hAnsi="Calibri"/>
-          <w:b/>
-          <w:bCs/>
-          <w:color w:val="595959"/>
-          <w:sz w:val="20"/>
-          <w:szCs w:val="20"/>
-        </w:rPr>
-        <w:t xml:space="preserve">Miguel Ángel Domínguez Castellano</w:t>
-      </w:r>
+        <w:t xml:space="preserve">de Pozuelo de Alarcón: de ella nace el proyecto y suya es la primera redacción. </w:t>
+      </w:r>
+      <w:hyperlink w:history="1" r:id="rIdn0itstlwoyw6gc4blkw_k">
+        <w:r>
+          <w:rPr>
+            <w:rFonts w:ascii="Calibri" w:cs="Calibri" w:eastAsia="Calibri" w:hAnsi="Calibri"/>
+            <w:b/>
+            <w:bCs/>
+            <w:color w:val="2F5496"/>
+            <w:sz w:val="20"/>
+            <w:szCs w:val="20"/>
+            <w:u w:val="single"/>
+          </w:rPr>
+          <w:t xml:space="preserve">Dr. José Antonio Ondiviela García</w:t>
+        </w:r>
+      </w:hyperlink>
+      <w:r>
+        <w:rPr>
+          <w:rFonts w:ascii="Calibri" w:cs="Calibri" w:eastAsia="Calibri" w:hAnsi="Calibri"/>
+          <w:color w:val="595959"/>
+          <w:sz w:val="20"/>
+          <w:szCs w:val="20"/>
+        </w:rPr>
+        <w:t xml:space="preserve">,</w:t>
+      </w:r>
+    </w:p>
+    <w:p>
+      <w:pPr>
+        <w:spacing w:after="140"/>
+        <w:jc w:val="center"/>
+      </w:pPr>
+      <w:r>
+        <w:rPr>
+          <w:rFonts w:ascii="Calibri" w:cs="Calibri" w:eastAsia="Calibri" w:hAnsi="Calibri"/>
+          <w:color w:val="595959"/>
+          <w:sz w:val="20"/>
+          <w:szCs w:val="20"/>
+        </w:rPr>
+        <w:t xml:space="preserve">profesor e investigador de la Universidad Francisco de Vitoria: la mirada del mercado y la idea que</w:t>
+      </w:r>
+    </w:p>
+    <w:p>
+      <w:pPr>
+        <w:spacing w:after="140"/>
+        <w:jc w:val="center"/>
+      </w:pPr>
+      <w:r>
+        <w:rPr>
+          <w:rFonts w:ascii="Calibri" w:cs="Calibri" w:eastAsia="Calibri" w:hAnsi="Calibri"/>
+          <w:color w:val="595959"/>
+          <w:sz w:val="20"/>
+          <w:szCs w:val="20"/>
+        </w:rPr>
+        <w:t xml:space="preserve">resuelve el problema de fondo. </w:t>
+      </w:r>
+      <w:hyperlink w:history="1" r:id="rId3_bw0xixvlk8b9cu6g9ob">
+        <w:r>
+          <w:rPr>
+            <w:rFonts w:ascii="Calibri" w:cs="Calibri" w:eastAsia="Calibri" w:hAnsi="Calibri"/>
+            <w:b/>
+            <w:bCs/>
+            <w:color w:val="2F5496"/>
+            <w:sz w:val="20"/>
+            <w:szCs w:val="20"/>
+            <w:u w:val="single"/>
+          </w:rPr>
+          <w:t xml:space="preserve">Miguel Ángel Domínguez Castellano</w:t>
+        </w:r>
+      </w:hyperlink>
       <w:r>
         <w:rPr>
           <w:rFonts w:ascii="Calibri" w:cs="Calibri" w:eastAsia="Calibri" w:hAnsi="Calibri"/>

</xml_diff>

<commit_message>
cdx: corrige los nueve graves del tercer Gauntlet
</commit_message>
<xml_diff>
--- a/docs/descargas/resumen-dos-paginas.docx
+++ b/docs/descargas/resumen-dos-paginas.docx
@@ -1580,7 +1580,7 @@
         <w:spacing w:after="140"/>
         <w:jc w:val="center"/>
       </w:pPr>
-      <w:hyperlink w:history="1" r:id="rIdxhfdop3ylzbokihweys4d">
+      <w:hyperlink w:history="1" r:id="rIdpgjievp9tk0znluahcvay">
         <w:r>
           <w:rPr>
             <w:rFonts w:ascii="Calibri" w:cs="Calibri" w:eastAsia="Calibri" w:hAnsi="Calibri"/>
@@ -1618,7 +1618,7 @@
         </w:rPr>
         <w:t xml:space="preserve">de Pozuelo de Alarcón: de ella nace el proyecto y suya es la primera redacción. </w:t>
       </w:r>
-      <w:hyperlink w:history="1" r:id="rId5ck9cnsdam2ryiikmwtjl">
+      <w:hyperlink w:history="1" r:id="rIdzngx2ch_3bfsme3nz6tus">
         <w:r>
           <w:rPr>
             <w:rFonts w:ascii="Calibri" w:cs="Calibri" w:eastAsia="Calibri" w:hAnsi="Calibri"/>
@@ -1671,7 +1671,7 @@
         </w:rPr>
         <w:t xml:space="preserve">resuelve el problema de fondo. </w:t>
       </w:r>
-      <w:hyperlink w:history="1" r:id="rIdupginmzdktax-pqltaa2v">
+      <w:hyperlink w:history="1" r:id="rIdms2p3hcd8xcoi0b_bsier">
         <w:r>
           <w:rPr>
             <w:rFonts w:ascii="Calibri" w:cs="Calibri" w:eastAsia="Calibri" w:hAnsi="Calibri"/>

</xml_diff>

<commit_message>
Quien viene después: Garvía, en los créditos y sólo ahí
Luis Garvía Vega entra citado detrás de Delfina, en la sección de
autoría del documento, como quien se incorpora al proyecto para
preparar con Ondiviela una publicación académica: no es un problema
de falta de recursos, es de gestión eficiente de los recursos.

Se dice que NO ha participado en este catálogo, que la publicación
es un trabajo distinto que se firma por separado, que nada de lo que
el catálogo afirma depende de ella, y que se hará desligada de
cualquier administración.

Por decisión de MAD no entra —de momento— en la portada web, en el
README, en el resumen de dos páginas, en la guía, en la página de
medios ni en la presentación.

Co-Authored-By: Claude Opus 5 <noreply@anthropic.com>
</commit_message>
<xml_diff>
--- a/docs/descargas/resumen-dos-paginas.docx
+++ b/docs/descargas/resumen-dos-paginas.docx
@@ -1190,7 +1190,7 @@
               <w:spacing w:after="36" w:line="216"/>
               <w:jc w:val="both"/>
             </w:pPr>
-            <w:hyperlink w:history="1" r:id="rIdghvoq43l85949b7h1deqa">
+            <w:hyperlink w:history="1" r:id="rIdy3qjs17w63w-w2wcw_zyi">
               <w:r>
                 <w:rPr>
                   <w:rFonts w:ascii="Calibri" w:cs="Calibri" w:eastAsia="Calibri" w:hAnsi="Calibri"/>
@@ -1213,7 +1213,7 @@
               </w:rPr>
               <w:t xml:space="preserve">, profesor e investigador de la Universidad Francisco de Vitoria: la mirada del mercado y la idea que resuelve el problema de fondo. </w:t>
             </w:r>
-            <w:hyperlink w:history="1" r:id="rIdonanxwk-m9212zi7zcguy">
+            <w:hyperlink w:history="1" r:id="rIdc6-a8gofzgodoo5tpu9gu">
               <w:r>
                 <w:rPr>
                   <w:rFonts w:ascii="Calibri" w:cs="Calibri" w:eastAsia="Calibri" w:hAnsi="Calibri"/>
@@ -1236,7 +1236,7 @@
               </w:rPr>
               <w:t xml:space="preserve">, CEO de Add4u y presidente de Alastria y del Clúster de Blockchain de la Comunidad de Madrid: la perspectiva de quien conoce las dos orillas, y la responsabilidad editorial de la publicación. </w:t>
             </w:r>
-            <w:hyperlink w:history="1" r:id="rIdso9j_ydbxedengwx3cwmm">
+            <w:hyperlink w:history="1" r:id="rId6cw4_jpxcgv-2b1_sl5aj">
               <w:r>
                 <w:rPr>
                   <w:rFonts w:ascii="Calibri" w:cs="Calibri" w:eastAsia="Calibri" w:hAnsi="Calibri"/>

</xml_diff>

<commit_message>
El objetivo del paper, citado por encima en el documento
Mejorar la eficiencia del sector público por la vía de mejores
prácticas de contratación, para mejorar la situación del país y de
Europa. Sobre tres ideas: soberanía tecnológica —decidir sobre los
datos propios, los desarrollos y la capacidad de cambiar de
proveedor—, usar de verdad la tecnología disponible para los
problemas grandes, y atacar la ineficiencia que ya existe con los
recursos que ya hay.

Con una precisión que protege el articulado: eso es el objetivo de la
publicación, NO una exigencia del catálogo. Ninguna cláusula impone
tecnología, red ni infraestructura concretas, y aquí la soberanía se
busca por la vía que no distorsiona la competencia —propiedad del
dato, reversibilidad y salida ordenada—, con remisión al §M7.3.

Co-Authored-By: Claude Opus 5 <noreply@anthropic.com>
</commit_message>
<xml_diff>
--- a/docs/descargas/resumen-dos-paginas.docx
+++ b/docs/descargas/resumen-dos-paginas.docx
@@ -1190,7 +1190,7 @@
               <w:spacing w:after="36" w:line="216"/>
               <w:jc w:val="both"/>
             </w:pPr>
-            <w:hyperlink w:history="1" r:id="rId3v48jey9puiqiepz6wpv1">
+            <w:hyperlink w:history="1" r:id="rIddokpeawmbn5f6hr1fg_x-">
               <w:r>
                 <w:rPr>
                   <w:rFonts w:ascii="Calibri" w:cs="Calibri" w:eastAsia="Calibri" w:hAnsi="Calibri"/>
@@ -1213,7 +1213,7 @@
               </w:rPr>
               <w:t xml:space="preserve">, profesor e investigador de la Universidad Francisco de Vitoria: la mirada del mercado y la idea que resuelve el problema de fondo. </w:t>
             </w:r>
-            <w:hyperlink w:history="1" r:id="rIdupqaixraw7foc10ad_j0k">
+            <w:hyperlink w:history="1" r:id="rId_kap8u3a2deifxgl9y7z7">
               <w:r>
                 <w:rPr>
                   <w:rFonts w:ascii="Calibri" w:cs="Calibri" w:eastAsia="Calibri" w:hAnsi="Calibri"/>
@@ -1236,7 +1236,7 @@
               </w:rPr>
               <w:t xml:space="preserve">, CEO de Add4u y presidente de Alastria y del Clúster de Blockchain de la Comunidad de Madrid: la perspectiva de quien conoce las dos orillas, y la responsabilidad editorial de la publicación. </w:t>
             </w:r>
-            <w:hyperlink w:history="1" r:id="rIdokwbb59z4e9w8gelzcrjt">
+            <w:hyperlink w:history="1" r:id="rIdcojqgvkmahngwjo6-2epb">
               <w:r>
                 <w:rPr>
                   <w:rFonts w:ascii="Calibri" w:cs="Calibri" w:eastAsia="Calibri" w:hAnsi="Calibri"/>

</xml_diff>